<commit_message>
fix: fix the diplome format
</commit_message>
<xml_diff>
--- a/modeles/doctorat/Diplome.docx
+++ b/modeles/doctorat/Diplome.docx
@@ -216,12 +216,19 @@
         <w:spacing w:before="240" w:line="480" w:lineRule="exact"/>
       </w:pPr>
       <w:r>
-        <w:t xml:space="preserve">      </w:t>
-      </w:r>
+        <w:t xml:space="preserve">  </w:t>
+      </w:r>
+    </w:p>
+    <w:p>
+      <w:pPr>
+        <w:widowControl/>
+        <w:bidi/>
+        <w:spacing w:before="240" w:line="480" w:lineRule="exact"/>
+      </w:pPr>
       <w:bookmarkStart w:id="0" w:name="_GoBack"/>
       <w:bookmarkEnd w:id="0"/>
       <w:r>
-        <w:t xml:space="preserve">                </w:t>
+        <w:t xml:space="preserve">                    </w:t>
       </w:r>
       <w:r>
         <w:rPr>
@@ -2632,6 +2639,7 @@
           <w:rtl/>
           <w:lang w:val="en-US"/>
         </w:rPr>
+        <w:lastRenderedPageBreak/>
         <w:tab/>
       </w:r>
       <w:r>
@@ -2730,7 +2738,6 @@
           <w:rtl/>
           <w:lang w:val="en-US"/>
         </w:rPr>
-        <w:lastRenderedPageBreak/>
         <w:tab/>
       </w:r>
       <w:r>

</xml_diff>